<commit_message>
TE1: audit fixes (cotangent, PDF function arguments, fresh slip values, negative angle, CheckIt notation notes, label halos), audit notes, README row
Co-Authored-By: Claude Opus 5.5 <noreply@anthropic.com>
Claude-Session: https://claude.ai/code/session_013Y8PfETWcMLvmUEpCdE8Wq
</commit_message>
<xml_diff>
--- a/support-materials/TE1/TE1_worked_examples.docx
+++ b/support-materials/TE1/TE1_worked_examples.docx
@@ -374,7 +374,17 @@
         <w:t xml:space="preserve">π/2+π/12</w:t>
       </w:r>
       <w:r>
-        <w:t xml:space="preserve"> is correct, but </w:t>
+        <w:t xml:space="preserve"> does equal </w:t>
+      </w:r>
+      <w:r>
+        <w:rPr>
+          <w:i/>
+          <w:iCs/>
+        </w:rPr>
+        <w:t xml:space="preserve">(7π)/12</w:t>
+      </w:r>
+      <w:r>
+        <w:t xml:space="preserve">, but </w:t>
       </w:r>
       <w:r>
         <w:rPr>
@@ -384,7 +394,7 @@
         <w:t xml:space="preserve">π/12</w:t>
       </w:r>
       <w:r>
-        <w:t xml:space="preserve"> is not on the unit circle, so it does not help. </w:t>
+        <w:t xml:space="preserve"> is not one of the angles you know, so it does not help. </w:t>
       </w:r>
       <w:r>
         <w:rPr>
@@ -796,7 +806,7 @@
           <w:i/>
           <w:iCs/>
         </w:rPr>
-        <w:t xml:space="preserve">π/4=(√2)/2</w:t>
+        <w:t xml:space="preserve">(π/4)=(√2)/2</w:t>
       </w:r>
       <w:r>
         <w:t xml:space="preserve">. Half of </w:t>
@@ -896,7 +906,7 @@
           <w:sz w:val="40"/>
           <w:szCs w:val="40"/>
         </w:rPr>
-        <w:t xml:space="preserve">((5π)/8)</w:t>
+        <w:t xml:space="preserve">(−(5π)/8)</w:t>
       </w:r>
     </w:p>
     <w:p>
@@ -929,7 +939,7 @@
         <w:t xml:space="preserve">A.  </w:t>
       </w:r>
       <w:r>
-        <w:t xml:space="preserve">Quadrant I, so the sine is above zero</w:t>
+        <w:t xml:space="preserve">Quadrant IV, so the sine is below zero</w:t>
       </w:r>
     </w:p>
     <w:p>
@@ -945,7 +955,7 @@
         <w:t xml:space="preserve">B.  </w:t>
       </w:r>
       <w:r>
-        <w:t xml:space="preserve">Quadrant II, so the sine is below zero</w:t>
+        <w:t xml:space="preserve">Quadrant II, so the sine is above zero</w:t>
       </w:r>
     </w:p>
     <w:p>
@@ -961,7 +971,7 @@
         <w:t xml:space="preserve">C.  </w:t>
       </w:r>
       <w:r>
-        <w:t xml:space="preserve">Quadrant II, so the sine is above zero</w:t>
+        <w:t xml:space="preserve">Quadrant III, so the sine is below zero</w:t>
       </w:r>
     </w:p>
     <w:p>
@@ -977,7 +987,7 @@
         <w:t xml:space="preserve">D.  </w:t>
       </w:r>
       <w:r>
-        <w:t xml:space="preserve">Quadrant III, so the sine is below zero</w:t>
+        <w:t xml:space="preserve">Quadrant III, so the sine is above zero</w:t>
       </w:r>
     </w:p>
     <w:p>
@@ -994,34 +1004,81 @@
         <w:spacing w:after="120" w:before="80" w:line="300"/>
       </w:pPr>
       <w:r>
-        <w:rPr>
-          <w:i/>
-          <w:iCs/>
-        </w:rPr>
-        <w:t xml:space="preserve">(5π)/8</w:t>
-      </w:r>
-      <w:r>
-        <w:t xml:space="preserve"> is between </w:t>
-      </w:r>
-      <w:r>
-        <w:rPr>
-          <w:i/>
-          <w:iCs/>
-        </w:rPr>
-        <w:t xml:space="preserve">(4π)/8=π/2</w:t>
-      </w:r>
-      <w:r>
-        <w:t xml:space="preserve"> and </w:t>
-      </w:r>
-      <w:r>
-        <w:rPr>
-          <w:i/>
-          <w:iCs/>
-        </w:rPr>
-        <w:t xml:space="preserve">(8π)/8=π</w:t>
-      </w:r>
-      <w:r>
-        <w:t xml:space="preserve">, so it is in Quadrant II, at 112.5°. Sine is the </w:t>
+        <w:t xml:space="preserve">A negative angle turns clockwise from the positive </w:t>
+      </w:r>
+      <w:r>
+        <w:rPr>
+          <w:i/>
+          <w:iCs/>
+        </w:rPr>
+        <w:t xml:space="preserve">x</w:t>
+      </w:r>
+      <w:r>
+        <w:t xml:space="preserve">-axis. </w:t>
+      </w:r>
+      <w:r>
+        <w:rPr>
+          <w:i/>
+          <w:iCs/>
+        </w:rPr>
+        <w:t xml:space="preserve">−(5π)/8</w:t>
+      </w:r>
+      <w:r>
+        <w:t xml:space="preserve"> is </w:t>
+      </w:r>
+      <w:r>
+        <w:rPr>
+          <w:i/>
+          <w:iCs/>
+        </w:rPr>
+        <w:t xml:space="preserve">−112.5</w:t>
+      </w:r>
+      <w:r>
+        <w:rPr>
+          <w:i/>
+          <w:iCs/>
+          <w:vertAlign w:val="superscript"/>
+        </w:rPr>
+        <w:t xml:space="preserve">°</w:t>
+      </w:r>
+      <w:r>
+        <w:t xml:space="preserve">: past </w:t>
+      </w:r>
+      <w:r>
+        <w:rPr>
+          <w:i/>
+          <w:iCs/>
+        </w:rPr>
+        <w:t xml:space="preserve">−90</w:t>
+      </w:r>
+      <w:r>
+        <w:rPr>
+          <w:i/>
+          <w:iCs/>
+          <w:vertAlign w:val="superscript"/>
+        </w:rPr>
+        <w:t xml:space="preserve">°</w:t>
+      </w:r>
+      <w:r>
+        <w:t xml:space="preserve"> but not yet </w:t>
+      </w:r>
+      <w:r>
+        <w:rPr>
+          <w:i/>
+          <w:iCs/>
+        </w:rPr>
+        <w:t xml:space="preserve">−180</w:t>
+      </w:r>
+      <w:r>
+        <w:rPr>
+          <w:i/>
+          <w:iCs/>
+          <w:vertAlign w:val="superscript"/>
+        </w:rPr>
+        <w:t xml:space="preserve">°</w:t>
+      </w:r>
+      <w:r>
+        <w:t xml:space="preserve">, so it lands in Quadrant III. Sine is the </w:t>
       </w:r>
       <w:r>
         <w:rPr>
@@ -1031,24 +1088,73 @@
         <w:t xml:space="preserve">y</w:t>
       </w:r>
       <w:r>
-        <w:t xml:space="preserve">-coordinate, and </w:t>
-      </w:r>
-      <w:r>
-        <w:rPr>
-          <w:i/>
-          <w:iCs/>
-        </w:rPr>
-        <w:t xml:space="preserve">y</w:t>
-      </w:r>
-      <w:r>
-        <w:t xml:space="preserve"> is above zero in Quadrant II. Cosine would be below zero there. </w:t>
-      </w:r>
-      <w:r>
-        <w:rPr>
-          <w:b/>
-          <w:bCs/>
-        </w:rPr>
-        <w:t xml:space="preserve">Quadrant II, and the sine is positive.</w:t>
+        <w:t xml:space="preserve">-coordinate, which is below zero there. Quadrant II is where </w:t>
+      </w:r>
+      <w:r>
+        <w:rPr>
+          <w:i/>
+          <w:iCs/>
+        </w:rPr>
+        <w:t xml:space="preserve">+(5π)/8</w:t>
+      </w:r>
+      <w:r>
+        <w:t xml:space="preserve"> lands. You can also use </w:t>
+      </w:r>
+      <w:r>
+        <w:t xml:space="preserve">sin</w:t>
+      </w:r>
+      <w:r>
+        <w:rPr>
+          <w:i/>
+          <w:iCs/>
+        </w:rPr>
+        <w:t xml:space="preserve">(−θ)=−</w:t>
+      </w:r>
+      <w:r>
+        <w:t xml:space="preserve">sin</w:t>
+      </w:r>
+      <w:r>
+        <w:rPr>
+          <w:i/>
+          <w:iCs/>
+        </w:rPr>
+        <w:t xml:space="preserve">θ</w:t>
+      </w:r>
+      <w:r>
+        <w:t xml:space="preserve">: </w:t>
+      </w:r>
+      <w:r>
+        <w:t xml:space="preserve">sin</w:t>
+      </w:r>
+      <w:r>
+        <w:rPr>
+          <w:i/>
+          <w:iCs/>
+        </w:rPr>
+        <w:t xml:space="preserve">((5π)/8)</w:t>
+      </w:r>
+      <w:r>
+        <w:t xml:space="preserve"> is above zero, so </w:t>
+      </w:r>
+      <w:r>
+        <w:t xml:space="preserve">sin</w:t>
+      </w:r>
+      <w:r>
+        <w:rPr>
+          <w:i/>
+          <w:iCs/>
+        </w:rPr>
+        <w:t xml:space="preserve">(−(5π)/8)</w:t>
+      </w:r>
+      <w:r>
+        <w:t xml:space="preserve"> is below zero. </w:t>
+      </w:r>
+      <w:r>
+        <w:rPr>
+          <w:b/>
+          <w:bCs/>
+        </w:rPr>
+        <w:t xml:space="preserve">Quadrant III, and the sine is below zero.</w:t>
       </w:r>
       <w:r>
         <w:t xml:space="preserve"> When a half-angle formula gives </w:t>
@@ -1226,27 +1332,27 @@
           <w:i/>
           <w:iCs/>
         </w:rPr>
-        <w:t xml:space="preserve">π/3</w:t>
-      </w:r>
-      <w:r>
-        <w:t xml:space="preserve">cos</w:t>
-      </w:r>
-      <w:r>
-        <w:rPr>
-          <w:i/>
-          <w:iCs/>
-        </w:rPr>
-        <w:t xml:space="preserve">π/4−</w:t>
-      </w:r>
-      <w:r>
-        <w:t xml:space="preserve">cos</w:t>
-      </w:r>
-      <w:r>
-        <w:rPr>
-          <w:i/>
-          <w:iCs/>
-        </w:rPr>
-        <w:t xml:space="preserve">π/3</w:t>
+        <w:t xml:space="preserve">(π/3)</w:t>
+      </w:r>
+      <w:r>
+        <w:t xml:space="preserve">cos</w:t>
+      </w:r>
+      <w:r>
+        <w:rPr>
+          <w:i/>
+          <w:iCs/>
+        </w:rPr>
+        <w:t xml:space="preserve">(π/4)−</w:t>
+      </w:r>
+      <w:r>
+        <w:t xml:space="preserve">cos</w:t>
+      </w:r>
+      <w:r>
+        <w:rPr>
+          <w:i/>
+          <w:iCs/>
+        </w:rPr>
+        <w:t xml:space="preserve">(π/3)</w:t>
       </w:r>
       <w:r>
         <w:t xml:space="preserve">sin</w:t>
@@ -1256,7 +1362,7 @@
           <w:i/>
           <w:iCs/>
         </w:rPr>
-        <w:t xml:space="preserve">π/4=(√3)/2·(√2)/2−1/2·(√2)/2=(√6−√2)/4≈ 0.259</w:t>
+        <w:t xml:space="preserve">(π/4)=(√3)/2·(√2)/2−1/2·(√2)/2=(√6−√2)/4≈ 0.259</w:t>
       </w:r>
       <w:r>
         <w:t xml:space="preserve">. The answer </w:t>
@@ -1279,7 +1385,7 @@
           <w:i/>
           <w:iCs/>
         </w:rPr>
-        <w:t xml:space="preserve">π/3−</w:t>
+        <w:t xml:space="preserve">(π/3)−</w:t>
       </w:r>
       <w:r>
         <w:t xml:space="preserve">sin</w:t>
@@ -1289,7 +1395,7 @@
           <w:i/>
           <w:iCs/>
         </w:rPr>
-        <w:t xml:space="preserve">π/4</w:t>
+        <w:t xml:space="preserve">(π/4)</w:t>
       </w:r>
       <w:r>
         <w:t xml:space="preserve">, which is not how sine works. The plus version is the cosine, and the reversed version is below zero, but </w:t>
@@ -1549,17 +1655,17 @@
           <w:i/>
           <w:iCs/>
         </w:rPr>
-        <w:t xml:space="preserve">π/3</w:t>
-      </w:r>
-      <w:r>
-        <w:t xml:space="preserve">cos</w:t>
-      </w:r>
-      <w:r>
-        <w:rPr>
-          <w:i/>
-          <w:iCs/>
-        </w:rPr>
-        <w:t xml:space="preserve">π/4−</w:t>
+        <w:t xml:space="preserve">(π/3)</w:t>
+      </w:r>
+      <w:r>
+        <w:t xml:space="preserve">cos</w:t>
+      </w:r>
+      <w:r>
+        <w:rPr>
+          <w:i/>
+          <w:iCs/>
+        </w:rPr>
+        <w:t xml:space="preserve">(π/4)−</w:t>
       </w:r>
       <w:r>
         <w:t xml:space="preserve">sin</w:t>
@@ -1569,7 +1675,7 @@
           <w:i/>
           <w:iCs/>
         </w:rPr>
-        <w:t xml:space="preserve">π/3</w:t>
+        <w:t xml:space="preserve">(π/3)</w:t>
       </w:r>
       <w:r>
         <w:t xml:space="preserve">sin</w:t>
@@ -1579,7 +1685,7 @@
           <w:i/>
           <w:iCs/>
         </w:rPr>
-        <w:t xml:space="preserve">π/4=(√2)/4−(√6)/4=(√2−√6)/4≈−0.259</w:t>
+        <w:t xml:space="preserve">(π/4)=(√2)/4−(√6)/4=(√2−√6)/4≈−0.259</w:t>
       </w:r>
       <w:r>
         <w:t xml:space="preserve">. That makes sense: </w:t>
@@ -1592,7 +1698,17 @@
         <w:t xml:space="preserve">(7π)/12</w:t>
       </w:r>
       <w:r>
-        <w:t xml:space="preserve"> is in Quadrant II, where cosine is below zero. The plus version keeps the plus sign, and </w:t>
+        <w:t xml:space="preserve"> is in Quadrant II, where cosine is below zero. The answer </w:t>
+      </w:r>
+      <w:r>
+        <w:rPr>
+          <w:i/>
+          <w:iCs/>
+        </w:rPr>
+        <w:t xml:space="preserve">(√6−√2)/4</w:t>
+      </w:r>
+      <w:r>
+        <w:t xml:space="preserve"> has the right size but the wrong sign for Quadrant II. The plus version keeps the plus sign, and </w:t>
       </w:r>
       <w:r>
         <w:rPr>
@@ -1856,7 +1972,7 @@
           <w:i/>
           <w:iCs/>
         </w:rPr>
-        <w:t xml:space="preserve">π/8=√((1+</w:t>
+        <w:t xml:space="preserve">(π/8)=√((1+</w:t>
       </w:r>
       <w:r>
         <w:t xml:space="preserve">cos</w:t>
@@ -1889,7 +2005,7 @@
           <w:i/>
           <w:iCs/>
         </w:rPr>
-        <w:t xml:space="preserve">π/8</w:t>
+        <w:t xml:space="preserve">(π/8)</w:t>
       </w:r>
       <w:r>
         <w:t xml:space="preserve">. The last one uses 1 + √2 instead of 1 + √2/2, and it is more than 1, which no cosine can be. </w:t>
@@ -2070,27 +2186,27 @@
           <w:i/>
           <w:iCs/>
         </w:rPr>
-        <w:t xml:space="preserve">(5π)/4</w:t>
-      </w:r>
-      <w:r>
-        <w:t xml:space="preserve">cos</w:t>
-      </w:r>
-      <w:r>
-        <w:rPr>
-          <w:i/>
-          <w:iCs/>
-        </w:rPr>
-        <w:t xml:space="preserve">π/6+</w:t>
-      </w:r>
-      <w:r>
-        <w:t xml:space="preserve">cos</w:t>
-      </w:r>
-      <w:r>
-        <w:rPr>
-          <w:i/>
-          <w:iCs/>
-        </w:rPr>
-        <w:t xml:space="preserve">(5π)/4</w:t>
+        <w:t xml:space="preserve">((5π)/4)</w:t>
+      </w:r>
+      <w:r>
+        <w:t xml:space="preserve">cos</w:t>
+      </w:r>
+      <w:r>
+        <w:rPr>
+          <w:i/>
+          <w:iCs/>
+        </w:rPr>
+        <w:t xml:space="preserve">(π/6)+</w:t>
+      </w:r>
+      <w:r>
+        <w:t xml:space="preserve">cos</w:t>
+      </w:r>
+      <w:r>
+        <w:rPr>
+          <w:i/>
+          <w:iCs/>
+        </w:rPr>
+        <w:t xml:space="preserve">((5π)/4)</w:t>
       </w:r>
       <w:r>
         <w:t xml:space="preserve">sin</w:t>
@@ -2100,7 +2216,7 @@
           <w:i/>
           <w:iCs/>
         </w:rPr>
-        <w:t xml:space="preserve">π/6=−(√2)/2·(√3)/2−(√2)/2·1/2=−(√6+√2)/4≈−0.966</w:t>
+        <w:t xml:space="preserve">(π/6)=−(√2)/2·(√3)/2−(√2)/2·1/2=−(√6+√2)/4≈−0.966</w:t>
       </w:r>
       <w:r>
         <w:t xml:space="preserve">. Check the sign: </w:t>
@@ -2123,7 +2239,7 @@
         <w:t xml:space="preserve">√6−√2</w:t>
       </w:r>
       <w:r>
-        <w:t xml:space="preserve"> version has the wrong size, and </w:t>
+        <w:t xml:space="preserve"> version puts a minus between the two terms, which is the difference formula, and </w:t>
       </w:r>
       <w:r>
         <w:rPr>
@@ -2479,7 +2595,17 @@
         <w:t xml:space="preserve">−12/5</w:t>
       </w:r>
       <w:r>
-        <w:t xml:space="preserve"> is the tangent. </w:t>
+        <w:t xml:space="preserve"> is the cotangent, </w:t>
+      </w:r>
+      <w:r>
+        <w:rPr>
+          <w:i/>
+          <w:iCs/>
+        </w:rPr>
+        <w:t xml:space="preserve">x/y</w:t>
+      </w:r>
+      <w:r>
+        <w:t xml:space="preserve">. </w:t>
       </w:r>
       <w:r>
         <w:rPr>
@@ -3155,7 +3281,27 @@
         <w:t xml:space="preserve">−20/21</w:t>
       </w:r>
       <w:r>
-        <w:t xml:space="preserve"> has the wrong denominator. </w:t>
+        <w:t xml:space="preserve"> divides the two legs, </w:t>
+      </w:r>
+      <w:r>
+        <w:rPr>
+          <w:i/>
+          <w:iCs/>
+        </w:rPr>
+        <w:t xml:space="preserve">y</w:t>
+      </w:r>
+      <w:r>
+        <w:t xml:space="preserve"> over </w:t>
+      </w:r>
+      <w:r>
+        <w:rPr>
+          <w:i/>
+          <w:iCs/>
+        </w:rPr>
+        <w:t xml:space="preserve">x</w:t>
+      </w:r>
+      <w:r>
+        <w:t xml:space="preserve">, with the sign flipped; that is not a cosine at all. </w:t>
       </w:r>
       <w:r>
         <w:rPr>
@@ -4876,7 +5022,7 @@
         <w:t xml:space="preserve">2· 3x=6x</w:t>
       </w:r>
       <w:r>
-        <w:t xml:space="preserve">; it does not square, so </w:t>
+        <w:t xml:space="preserve">; the 3 is not squared, so </w:t>
       </w:r>
       <w:r>
         <w:t xml:space="preserve">cos</w:t>
@@ -4965,7 +5111,7 @@
           <w:sz w:val="40"/>
           <w:szCs w:val="40"/>
         </w:rPr>
-        <w:t xml:space="preserve">π/12=</w:t>
+        <w:t xml:space="preserve">((5π)/12)=</w:t>
       </w:r>
       <w:r>
         <w:rPr>
@@ -4981,7 +5127,7 @@
           <w:sz w:val="40"/>
           <w:szCs w:val="40"/>
         </w:rPr>
-        <w:t xml:space="preserve">π/3−</w:t>
+        <w:t xml:space="preserve">(π/4)+</w:t>
       </w:r>
       <w:r>
         <w:rPr>
@@ -4997,7 +5143,7 @@
           <w:sz w:val="40"/>
           <w:szCs w:val="40"/>
         </w:rPr>
-        <w:t xml:space="preserve">π/4</w:t>
+        <w:t xml:space="preserve">(π/6)</w:t>
       </w:r>
     </w:p>
     <w:p>
@@ -5012,7 +5158,7 @@
           <w:sz w:val="40"/>
           <w:szCs w:val="40"/>
         </w:rPr>
-        <w:t xml:space="preserve">=(√3−√2)/2</w:t>
+        <w:t xml:space="preserve">=(√2+1)/2</w:t>
       </w:r>
     </w:p>
     <w:p>
@@ -5039,7 +5185,7 @@
           <w:i/>
           <w:iCs/>
         </w:rPr>
-        <w:t xml:space="preserve">π/12</w:t>
+        <w:t xml:space="preserve">((5π)/12)</w:t>
       </w:r>
       <w:r>
         <w:t xml:space="preserve"> with this work. What is the mistake, if any?</w:t>
@@ -5074,7 +5220,7 @@
         <w:t xml:space="preserve">B.  </w:t>
       </w:r>
       <w:r>
-        <w:t xml:space="preserve">The angles should be π/4 − π/6 instead of π/3 − π/4.</w:t>
+        <w:t xml:space="preserve">The angles should be π/2 − π/12 instead of π/4 + π/6.</w:t>
       </w:r>
     </w:p>
     <w:p>
@@ -5090,7 +5236,7 @@
         <w:t xml:space="preserve">C.  </w:t>
       </w:r>
       <w:r>
-        <w:t xml:space="preserve">Sine does not split over a difference like that.</w:t>
+        <w:t xml:space="preserve">Sine does not split over a sum like that.</w:t>
       </w:r>
     </w:p>
     <w:p>
@@ -5106,7 +5252,7 @@
         <w:t xml:space="preserve">D.  </w:t>
       </w:r>
       <w:r>
-        <w:t xml:space="preserve">It should be sin(π/3) + sin(π/4) instead.</w:t>
+        <w:t xml:space="preserve">It should be sin(π/4) − sin(π/6) instead.</w:t>
       </w:r>
     </w:p>
     <w:p>
@@ -5130,7 +5276,7 @@
           <w:i/>
           <w:iCs/>
         </w:rPr>
-        <w:t xml:space="preserve">(A−B)=</w:t>
+        <w:t xml:space="preserve">(A+B)=</w:t>
       </w:r>
       <w:r>
         <w:t xml:space="preserve">sin</w:t>
@@ -5140,7 +5286,7 @@
           <w:i/>
           <w:iCs/>
         </w:rPr>
-        <w:t xml:space="preserve"> Acos B−</w:t>
+        <w:t xml:space="preserve"> Acos B+</w:t>
       </w:r>
       <w:r>
         <w:t xml:space="preserve">cos</w:t>
@@ -5163,7 +5309,7 @@
           <w:i/>
           <w:iCs/>
         </w:rPr>
-        <w:t xml:space="preserve"> A−</w:t>
+        <w:t xml:space="preserve"> A+</w:t>
       </w:r>
       <w:r>
         <w:t xml:space="preserve">sin</w:t>
@@ -5183,20 +5329,20 @@
           <w:i/>
           <w:iCs/>
         </w:rPr>
-        <w:t xml:space="preserve">(√6−√2)/4≈ 0.259</w:t>
-      </w:r>
-      <w:r>
-        <w:t xml:space="preserve">, while the student's answer is about 0.159. Changing to </w:t>
-      </w:r>
-      <w:r>
-        <w:rPr>
-          <w:i/>
-          <w:iCs/>
-        </w:rPr>
-        <w:t xml:space="preserve">π/4−π/6</w:t>
-      </w:r>
-      <w:r>
-        <w:t xml:space="preserve"> is a fine difference, but splitting the sine is still wrong. </w:t>
+        <w:t xml:space="preserve">(√2)/2·(√3)/2+(√2)/2·1/2=(√6+√2)/4≈ 0.966</w:t>
+      </w:r>
+      <w:r>
+        <w:t xml:space="preserve">. The student's answer is about 1.207, more than 1, which no sine can be. The angles </w:t>
+      </w:r>
+      <w:r>
+        <w:rPr>
+          <w:i/>
+          <w:iCs/>
+        </w:rPr>
+        <w:t xml:space="preserve">π/4+π/6</w:t>
+      </w:r>
+      <w:r>
+        <w:t xml:space="preserve"> were fine. </w:t>
       </w:r>
       <w:r>
         <w:rPr>
@@ -5212,7 +5358,7 @@
           <w:i/>
           <w:iCs/>
         </w:rPr>
-        <w:t xml:space="preserve">(√6−√2)/4</w:t>
+        <w:t xml:space="preserve">(√6+√2)/4</w:t>
       </w:r>
       <w:r>
         <w:rPr>
@@ -5260,7 +5406,7 @@
           <w:sz w:val="40"/>
           <w:szCs w:val="40"/>
         </w:rPr>
-        <w:t xml:space="preserve">θ=1−(8/17)</w:t>
+        <w:t xml:space="preserve">θ=1−(20/29)</w:t>
       </w:r>
       <w:r>
         <w:rPr>
@@ -5279,7 +5425,7 @@
           <w:sz w:val="40"/>
           <w:szCs w:val="40"/>
         </w:rPr>
-        <w:t xml:space="preserve">=225/289</w:t>
+        <w:t xml:space="preserve">=441/841</w:t>
       </w:r>
     </w:p>
     <w:p>
@@ -5301,7 +5447,7 @@
           <w:sz w:val="40"/>
           <w:szCs w:val="40"/>
         </w:rPr>
-        <w:t xml:space="preserve">θ=−15/17</w:t>
+        <w:t xml:space="preserve">θ=−21/29</w:t>
       </w:r>
     </w:p>
     <w:p>
@@ -5328,7 +5474,7 @@
           <w:i/>
           <w:iCs/>
         </w:rPr>
-        <w:t xml:space="preserve">θ=8/17</w:t>
+        <w:t xml:space="preserve">θ=20/29</w:t>
       </w:r>
       <w:r>
         <w:t xml:space="preserve"> with </w:t>
@@ -5386,7 +5532,7 @@
         <w:t xml:space="preserve">B.  </w:t>
       </w:r>
       <w:r>
-        <w:t xml:space="preserve">The sine should be 15/17, without the minus sign.</w:t>
+        <w:t xml:space="preserve">The sine should be 21/29, without the minus sign.</w:t>
       </w:r>
     </w:p>
     <w:p>
@@ -5402,7 +5548,7 @@
         <w:t xml:space="preserve">C.  </w:t>
       </w:r>
       <w:r>
-        <w:t xml:space="preserve">The answer should stay as 225/289.</w:t>
+        <w:t xml:space="preserve">The answer should stay as 441/841.</w:t>
       </w:r>
     </w:p>
     <w:p>
@@ -5418,7 +5564,7 @@
         <w:t xml:space="preserve">D.  </w:t>
       </w:r>
       <w:r>
-        <w:t xml:space="preserve">It should be 1 − 8/17, so the sine is 9/17.</w:t>
+        <w:t xml:space="preserve">It should be 1 − 20/29, so the sine is 9/29.</w:t>
       </w:r>
     </w:p>
     <w:p>
@@ -5439,7 +5585,7 @@
           <w:i/>
           <w:iCs/>
         </w:rPr>
-        <w:t xml:space="preserve">1−64/289=225/289</w:t>
+        <w:t xml:space="preserve">1−400/841=441/841</w:t>
       </w:r>
       <w:r>
         <w:t xml:space="preserve">, and its square root is </w:t>
@@ -5449,7 +5595,7 @@
           <w:i/>
           <w:iCs/>
         </w:rPr>
-        <w:t xml:space="preserve">15/17</w:t>
+        <w:t xml:space="preserve">21/29</w:t>
       </w:r>
       <w:r>
         <w:t xml:space="preserve">. In Quadrant IV, </w:t>
@@ -5510,7 +5656,7 @@
           <w:sz w:val="40"/>
           <w:szCs w:val="40"/>
         </w:rPr>
-        <w:t xml:space="preserve">θ=1−25/169=144/169</w:t>
+        <w:t xml:space="preserve">θ=1−49/625=576/625</w:t>
       </w:r>
     </w:p>
     <w:p>
@@ -5532,7 +5678,7 @@
           <w:sz w:val="40"/>
           <w:szCs w:val="40"/>
         </w:rPr>
-        <w:t xml:space="preserve">θ=12/13</w:t>
+        <w:t xml:space="preserve">θ=24/25</w:t>
       </w:r>
     </w:p>
     <w:p>
@@ -5559,7 +5705,7 @@
           <w:i/>
           <w:iCs/>
         </w:rPr>
-        <w:t xml:space="preserve">θ=5/13</w:t>
+        <w:t xml:space="preserve">θ=7/25</w:t>
       </w:r>
       <w:r>
         <w:t xml:space="preserve"> with </w:t>
@@ -5601,7 +5747,7 @@
         <w:t xml:space="preserve">A.  </w:t>
       </w:r>
       <w:r>
-        <w:t xml:space="preserve">The cosine should be 8/13, from 13 − 5.</w:t>
+        <w:t xml:space="preserve">The cosine should be 18/25, from 25 − 7.</w:t>
       </w:r>
     </w:p>
     <w:p>
@@ -5617,7 +5763,7 @@
         <w:t xml:space="preserve">B.  </w:t>
       </w:r>
       <w:r>
-        <w:t xml:space="preserve">In Quadrant II the cosine is −12/13.</w:t>
+        <w:t xml:space="preserve">In Quadrant II the cosine is −24/25.</w:t>
       </w:r>
     </w:p>
     <w:p>
@@ -5649,7 +5795,7 @@
         <w:t xml:space="preserve">D.  </w:t>
       </w:r>
       <w:r>
-        <w:t xml:space="preserve">It should be 1 + 25/169, so the cosine is 13/12.</w:t>
+        <w:t xml:space="preserve">It should be 1 + 49/625, which makes the cosine more than 1.</w:t>
       </w:r>
     </w:p>
     <w:p>
@@ -5673,7 +5819,7 @@
           <w:i/>
           <w:iCs/>
         </w:rPr>
-        <w:t xml:space="preserve">±12/13</w:t>
+        <w:t xml:space="preserve">±24/25</w:t>
       </w:r>
       <w:r>
         <w:t xml:space="preserve">, and the student kept the wrong one. In Quadrant II, </w:t>
@@ -5702,7 +5848,7 @@
           <w:i/>
           <w:iCs/>
         </w:rPr>
-        <w:t xml:space="preserve">θ=−12/13</w:t>
+        <w:t xml:space="preserve">θ=−24/25</w:t>
       </w:r>
       <w:r>
         <w:rPr>
@@ -5740,7 +5886,7 @@
           <w:sz w:val="40"/>
           <w:szCs w:val="40"/>
         </w:rPr>
-        <w:t xml:space="preserve">π/8=1/2</w:t>
+        <w:t xml:space="preserve">((3π)/8)=1/2·</w:t>
       </w:r>
       <w:r>
         <w:rPr>
@@ -5756,7 +5902,7 @@
           <w:sz w:val="40"/>
           <w:szCs w:val="40"/>
         </w:rPr>
-        <w:t xml:space="preserve">π/4=(√2)/4</w:t>
+        <w:t xml:space="preserve">((3π)/4)=−(√2)/4</w:t>
       </w:r>
     </w:p>
     <w:p>
@@ -5783,7 +5929,7 @@
           <w:i/>
           <w:iCs/>
         </w:rPr>
-        <w:t xml:space="preserve">π/8</w:t>
+        <w:t xml:space="preserve">((3π)/8)</w:t>
       </w:r>
       <w:r>
         <w:t xml:space="preserve"> with this work. What is the mistake, if any?</w:t>
@@ -5818,7 +5964,7 @@
         <w:t xml:space="preserve">B.  </w:t>
       </w:r>
       <w:r>
-        <w:t xml:space="preserve">It should be 2 cos(π/4), which is √2.</w:t>
+        <w:t xml:space="preserve">It should be 2 cos(3π/4), which is −√2.</w:t>
       </w:r>
     </w:p>
     <w:p>
@@ -5834,7 +5980,7 @@
         <w:t xml:space="preserve">C.  </w:t>
       </w:r>
       <w:r>
-        <w:t xml:space="preserve">The answer should be below zero, so it is −√2/4.</w:t>
+        <w:t xml:space="preserve">The answer should be above zero, so it is √2/4.</w:t>
       </w:r>
     </w:p>
     <w:p>
@@ -5877,7 +6023,7 @@
           <w:i/>
           <w:iCs/>
         </w:rPr>
-        <w:t xml:space="preserve">θ/2=±√((1+</w:t>
+        <w:t xml:space="preserve">(θ/2)=±√((1+</w:t>
       </w:r>
       <w:r>
         <w:t xml:space="preserve">cos</w:t>
@@ -5897,33 +6043,53 @@
           <w:i/>
           <w:iCs/>
         </w:rPr>
-        <w:t xml:space="preserve">θ=π/4</w:t>
-      </w:r>
-      <w:r>
-        <w:t xml:space="preserve"> in Quadrant I, </w:t>
-      </w:r>
-      <w:r>
-        <w:t xml:space="preserve">cos</w:t>
-      </w:r>
-      <w:r>
-        <w:rPr>
-          <w:i/>
-          <w:iCs/>
-        </w:rPr>
-        <w:t xml:space="preserve">π/8=(√(2+√2))/2≈ 0.924</w:t>
-      </w:r>
-      <w:r>
-        <w:t xml:space="preserve">. A quick check: </w:t>
-      </w:r>
-      <w:r>
-        <w:rPr>
-          <w:i/>
-          <w:iCs/>
-        </w:rPr>
-        <w:t xml:space="preserve">π/8</w:t>
-      </w:r>
-      <w:r>
-        <w:t xml:space="preserve"> is close to 0, so its cosine should be close to 1, not 0.354. </w:t>
+        <w:t xml:space="preserve">θ=(3π)/4</w:t>
+      </w:r>
+      <w:r>
+        <w:t xml:space="preserve">, </w:t>
+      </w:r>
+      <w:r>
+        <w:t xml:space="preserve">cos</w:t>
+      </w:r>
+      <w:r>
+        <w:rPr>
+          <w:i/>
+          <w:iCs/>
+        </w:rPr>
+        <w:t xml:space="preserve">θ=−(√2)/2</w:t>
+      </w:r>
+      <w:r>
+        <w:t xml:space="preserve">, and </w:t>
+      </w:r>
+      <w:r>
+        <w:rPr>
+          <w:i/>
+          <w:iCs/>
+        </w:rPr>
+        <w:t xml:space="preserve">(3π)/8</w:t>
+      </w:r>
+      <w:r>
+        <w:t xml:space="preserve"> is in Quadrant I, so take the positive root: </w:t>
+      </w:r>
+      <w:r>
+        <w:rPr>
+          <w:i/>
+          <w:iCs/>
+        </w:rPr>
+        <w:t xml:space="preserve">√((1−√2/2)/2)=(√(2−√2))/2≈ 0.383</w:t>
+      </w:r>
+      <w:r>
+        <w:t xml:space="preserve">. A quick check: an angle in Quadrant I cannot have a cosine below zero. Fixing only the sign, to </w:t>
+      </w:r>
+      <w:r>
+        <w:rPr>
+          <w:i/>
+          <w:iCs/>
+        </w:rPr>
+        <w:t xml:space="preserve">(√2)/4</w:t>
+      </w:r>
+      <w:r>
+        <w:t xml:space="preserve">, still halves the cosine. </w:t>
       </w:r>
       <w:r>
         <w:rPr>
@@ -5939,7 +6105,7 @@
           <w:i/>
           <w:iCs/>
         </w:rPr>
-        <w:t xml:space="preserve">(√(2+√2))/2</w:t>
+        <w:t xml:space="preserve">(√(2−√2))/2</w:t>
       </w:r>
       <w:r>
         <w:rPr>

</xml_diff>

<commit_message>
TE1: Slip 4 work on three lines so it reflows at 320 px with text spacing (WCAG 1.4.10/1.4.12)
Co-Authored-By: Claude Opus 5.5 <noreply@anthropic.com>
Claude-Session: https://claude.ai/code/session_013Y8PfETWcMLvmUEpCdE8Wq
</commit_message>
<xml_diff>
--- a/support-materials/TE1/TE1_worked_examples.docx
+++ b/support-materials/TE1/TE1_worked_examples.docx
@@ -5869,7 +5869,7 @@
     </w:p>
     <w:p>
       <w:pPr>
-        <w:spacing w:after="200" w:before="200"/>
+        <w:spacing w:after="40" w:before="200"/>
         <w:jc w:val="center"/>
       </w:pPr>
       <w:r>
@@ -5886,23 +5886,53 @@
           <w:sz w:val="40"/>
           <w:szCs w:val="40"/>
         </w:rPr>
-        <w:t xml:space="preserve">((3π)/8)=1/2·</w:t>
-      </w:r>
-      <w:r>
-        <w:rPr>
+        <w:t xml:space="preserve">((3π)/8)</w:t>
+      </w:r>
+    </w:p>
+    <w:p>
+      <w:pPr>
+        <w:spacing w:after="40" w:before="40"/>
+        <w:jc w:val="center"/>
+      </w:pPr>
+      <w:r>
+        <w:rPr>
+          <w:i/>
+          <w:iCs/>
           <w:sz w:val="40"/>
           <w:szCs w:val="40"/>
         </w:rPr>
-        <w:t xml:space="preserve">cos</w:t>
-      </w:r>
-      <w:r>
-        <w:rPr>
-          <w:i/>
-          <w:iCs/>
+        <w:t xml:space="preserve">=1/2·</w:t>
+      </w:r>
+      <w:r>
+        <w:rPr>
           <w:sz w:val="40"/>
           <w:szCs w:val="40"/>
         </w:rPr>
-        <w:t xml:space="preserve">((3π)/4)=−(√2)/4</w:t>
+        <w:t xml:space="preserve">cos</w:t>
+      </w:r>
+      <w:r>
+        <w:rPr>
+          <w:i/>
+          <w:iCs/>
+          <w:sz w:val="40"/>
+          <w:szCs w:val="40"/>
+        </w:rPr>
+        <w:t xml:space="preserve">((3π)/4)</w:t>
+      </w:r>
+    </w:p>
+    <w:p>
+      <w:pPr>
+        <w:spacing w:after="200" w:before="40"/>
+        <w:jc w:val="center"/>
+      </w:pPr>
+      <w:r>
+        <w:rPr>
+          <w:i/>
+          <w:iCs/>
+          <w:sz w:val="40"/>
+          <w:szCs w:val="40"/>
+        </w:rPr>
+        <w:t xml:space="preserve">=−(√2)/4</w:t>
       </w:r>
     </w:p>
     <w:p>

</xml_diff>

<commit_message>
TE2: audit fixes (single correct answer in Simplify 4, speech, one-side wording, CheckIt forms), audit notes, README row; doc tool keeps function names apart; TE1 doc regenerated
Co-Authored-By: Claude Opus 5.5 <noreply@anthropic.com>
Claude-Session: https://claude.ai/code/session_013Y8PfETWcMLvmUEpCdE8Wq
</commit_message>
<xml_diff>
--- a/support-materials/TE1/TE1_worked_examples.docx
+++ b/support-materials/TE1/TE1_worked_examples.docx
@@ -1332,7 +1332,7 @@
           <w:i/>
           <w:iCs/>
         </w:rPr>
-        <w:t xml:space="preserve">(π/3)</w:t>
+        <w:t xml:space="preserve">(π/3) </w:t>
       </w:r>
       <w:r>
         <w:t xml:space="preserve">cos</w:t>
@@ -1352,7 +1352,7 @@
           <w:i/>
           <w:iCs/>
         </w:rPr>
-        <w:t xml:space="preserve">(π/3)</w:t>
+        <w:t xml:space="preserve">(π/3) </w:t>
       </w:r>
       <w:r>
         <w:t xml:space="preserve">sin</w:t>
@@ -1655,7 +1655,7 @@
           <w:i/>
           <w:iCs/>
         </w:rPr>
-        <w:t xml:space="preserve">(π/3)</w:t>
+        <w:t xml:space="preserve">(π/3) </w:t>
       </w:r>
       <w:r>
         <w:t xml:space="preserve">cos</w:t>
@@ -1675,7 +1675,7 @@
           <w:i/>
           <w:iCs/>
         </w:rPr>
-        <w:t xml:space="preserve">(π/3)</w:t>
+        <w:t xml:space="preserve">(π/3) </w:t>
       </w:r>
       <w:r>
         <w:t xml:space="preserve">sin</w:t>
@@ -2186,7 +2186,7 @@
           <w:i/>
           <w:iCs/>
         </w:rPr>
-        <w:t xml:space="preserve">((5π)/4)</w:t>
+        <w:t xml:space="preserve">((5π)/4) </w:t>
       </w:r>
       <w:r>
         <w:t xml:space="preserve">cos</w:t>
@@ -2206,7 +2206,7 @@
           <w:i/>
           <w:iCs/>
         </w:rPr>
-        <w:t xml:space="preserve">((5π)/4)</w:t>
+        <w:t xml:space="preserve">((5π)/4) </w:t>
       </w:r>
       <w:r>
         <w:t xml:space="preserve">sin</w:t>
@@ -3760,7 +3760,7 @@
           <w:sz w:val="40"/>
           <w:szCs w:val="40"/>
         </w:rPr>
-        <w:t xml:space="preserve">3</w:t>
+        <w:t xml:space="preserve">3 </w:t>
       </w:r>
       <w:r>
         <w:rPr>
@@ -3823,7 +3823,7 @@
           <w:i/>
           <w:iCs/>
         </w:rPr>
-        <w:t xml:space="preserve">3/2−3/2</w:t>
+        <w:t xml:space="preserve">3/2−3/2 </w:t>
       </w:r>
       <w:r>
         <w:t xml:space="preserve">cos</w:t>
@@ -3853,7 +3853,7 @@
           <w:i/>
           <w:iCs/>
         </w:rPr>
-        <w:t xml:space="preserve">3/2+3/2</w:t>
+        <w:t xml:space="preserve">3/2+3/2 </w:t>
       </w:r>
       <w:r>
         <w:t xml:space="preserve">cos</w:t>
@@ -3883,7 +3883,7 @@
           <w:i/>
           <w:iCs/>
         </w:rPr>
-        <w:t xml:space="preserve">3/2−3/2</w:t>
+        <w:t xml:space="preserve">3/2−3/2 </w:t>
       </w:r>
       <w:r>
         <w:t xml:space="preserve">cos</w:t>
@@ -3913,7 +3913,7 @@
           <w:i/>
           <w:iCs/>
         </w:rPr>
-        <w:t xml:space="preserve">1/2−3/2</w:t>
+        <w:t xml:space="preserve">1/2−3/2 </w:t>
       </w:r>
       <w:r>
         <w:t xml:space="preserve">cos</w:t>
@@ -3995,7 +3995,7 @@
           <w:i/>
           <w:iCs/>
         </w:rPr>
-        <w:t xml:space="preserve">(8x))/2=3/2−3/2</w:t>
+        <w:t xml:space="preserve">(8x))/2=3/2−3/2 </w:t>
       </w:r>
       <w:r>
         <w:t xml:space="preserve">cos</w:t>
@@ -4070,7 +4070,7 @@
           <w:i/>
           <w:iCs/>
         </w:rPr>
-        <w:t xml:space="preserve">3/2−3/2</w:t>
+        <w:t xml:space="preserve">3/2−3/2 </w:t>
       </w:r>
       <w:r>
         <w:rPr>
@@ -4117,7 +4117,7 @@
           <w:sz w:val="40"/>
           <w:szCs w:val="40"/>
         </w:rPr>
-        <w:t xml:space="preserve">5</w:t>
+        <w:t xml:space="preserve">5 </w:t>
       </w:r>
       <w:r>
         <w:rPr>
@@ -4180,7 +4180,7 @@
           <w:i/>
           <w:iCs/>
         </w:rPr>
-        <w:t xml:space="preserve">5/2−5/2</w:t>
+        <w:t xml:space="preserve">5/2−5/2 </w:t>
       </w:r>
       <w:r>
         <w:t xml:space="preserve">cos</w:t>
@@ -4210,7 +4210,7 @@
           <w:i/>
           <w:iCs/>
         </w:rPr>
-        <w:t xml:space="preserve">5/2+5/2</w:t>
+        <w:t xml:space="preserve">5/2+5/2 </w:t>
       </w:r>
       <w:r>
         <w:t xml:space="preserve">cos</w:t>
@@ -4240,7 +4240,7 @@
           <w:i/>
           <w:iCs/>
         </w:rPr>
-        <w:t xml:space="preserve">5/2+5/2</w:t>
+        <w:t xml:space="preserve">5/2+5/2 </w:t>
       </w:r>
       <w:r>
         <w:t xml:space="preserve">cos</w:t>
@@ -4270,7 +4270,7 @@
           <w:i/>
           <w:iCs/>
         </w:rPr>
-        <w:t xml:space="preserve">5+5</w:t>
+        <w:t xml:space="preserve">5+5 </w:t>
       </w:r>
       <w:r>
         <w:t xml:space="preserve">cos</w:t>
@@ -4352,7 +4352,7 @@
           <w:i/>
           <w:iCs/>
         </w:rPr>
-        <w:t xml:space="preserve">(4x))/2=5/2+5/2</w:t>
+        <w:t xml:space="preserve">(4x))/2=5/2+5/2 </w:t>
       </w:r>
       <w:r>
         <w:t xml:space="preserve">cos</w:t>
@@ -4382,7 +4382,7 @@
           <w:i/>
           <w:iCs/>
         </w:rPr>
-        <w:t xml:space="preserve">5</w:t>
+        <w:t xml:space="preserve">5 </w:t>
       </w:r>
       <w:r>
         <w:t xml:space="preserve">cos</w:t>
@@ -4433,7 +4433,7 @@
           <w:i/>
           <w:iCs/>
         </w:rPr>
-        <w:t xml:space="preserve">5+5</w:t>
+        <w:t xml:space="preserve">5+5 </w:t>
       </w:r>
       <w:r>
         <w:t xml:space="preserve">cos</w:t>
@@ -4455,7 +4455,7 @@
           <w:i/>
           <w:iCs/>
         </w:rPr>
-        <w:t xml:space="preserve">5/2+5/2</w:t>
+        <w:t xml:space="preserve">5/2+5/2 </w:t>
       </w:r>
       <w:r>
         <w:rPr>
@@ -4502,7 +4502,7 @@
           <w:sz w:val="40"/>
           <w:szCs w:val="40"/>
         </w:rPr>
-        <w:t xml:space="preserve">2</w:t>
+        <w:t xml:space="preserve">2 </w:t>
       </w:r>
       <w:r>
         <w:rPr>
@@ -4655,7 +4655,7 @@
           <w:i/>
           <w:iCs/>
         </w:rPr>
-        <w:t xml:space="preserve">2−2</w:t>
+        <w:t xml:space="preserve">2−2 </w:t>
       </w:r>
       <w:r>
         <w:t xml:space="preserve">cos</w:t>
@@ -4736,7 +4736,7 @@
           <w:i/>
           <w:iCs/>
         </w:rPr>
-        <w:t xml:space="preserve">2−2</w:t>
+        <w:t xml:space="preserve">2−2 </w:t>
       </w:r>
       <w:r>
         <w:t xml:space="preserve">cos</w:t>
@@ -4805,7 +4805,7 @@
           <w:sz w:val="40"/>
           <w:szCs w:val="40"/>
         </w:rPr>
-        <w:t xml:space="preserve">4</w:t>
+        <w:t xml:space="preserve">4 </w:t>
       </w:r>
       <w:r>
         <w:rPr>
@@ -4868,7 +4868,7 @@
           <w:i/>
           <w:iCs/>
         </w:rPr>
-        <w:t xml:space="preserve">2−2</w:t>
+        <w:t xml:space="preserve">2−2 </w:t>
       </w:r>
       <w:r>
         <w:t xml:space="preserve">cos</w:t>
@@ -4898,7 +4898,7 @@
           <w:i/>
           <w:iCs/>
         </w:rPr>
-        <w:t xml:space="preserve">2+2</w:t>
+        <w:t xml:space="preserve">2+2 </w:t>
       </w:r>
       <w:r>
         <w:t xml:space="preserve">cos</w:t>
@@ -4928,7 +4928,7 @@
           <w:i/>
           <w:iCs/>
         </w:rPr>
-        <w:t xml:space="preserve">2+2</w:t>
+        <w:t xml:space="preserve">2+2 </w:t>
       </w:r>
       <w:r>
         <w:t xml:space="preserve">cos</w:t>
@@ -4958,7 +4958,7 @@
           <w:i/>
           <w:iCs/>
         </w:rPr>
-        <w:t xml:space="preserve">2+2</w:t>
+        <w:t xml:space="preserve">2+2 </w:t>
       </w:r>
       <w:r>
         <w:t xml:space="preserve">cos</w:t>
@@ -4999,7 +4999,7 @@
           <w:i/>
           <w:iCs/>
         </w:rPr>
-        <w:t xml:space="preserve">(6x))/2=2+2</w:t>
+        <w:t xml:space="preserve">(6x))/2=2+2 </w:t>
       </w:r>
       <w:r>
         <w:t xml:space="preserve">cos</w:t>
@@ -5057,7 +5057,7 @@
           <w:i/>
           <w:iCs/>
         </w:rPr>
-        <w:t xml:space="preserve">2+2</w:t>
+        <w:t xml:space="preserve">2+2 </w:t>
       </w:r>
       <w:r>
         <w:rPr>
@@ -5286,17 +5286,37 @@
           <w:i/>
           <w:iCs/>
         </w:rPr>
-        <w:t xml:space="preserve"> Acos B+</w:t>
-      </w:r>
-      <w:r>
-        <w:t xml:space="preserve">cos</w:t>
-      </w:r>
-      <w:r>
-        <w:rPr>
-          <w:i/>
-          <w:iCs/>
-        </w:rPr>
-        <w:t xml:space="preserve"> Asin B</w:t>
+        <w:t xml:space="preserve"> A </w:t>
+      </w:r>
+      <w:r>
+        <w:t xml:space="preserve">cos</w:t>
+      </w:r>
+      <w:r>
+        <w:rPr>
+          <w:i/>
+          <w:iCs/>
+        </w:rPr>
+        <w:t xml:space="preserve"> B+</w:t>
+      </w:r>
+      <w:r>
+        <w:t xml:space="preserve">cos</w:t>
+      </w:r>
+      <w:r>
+        <w:rPr>
+          <w:i/>
+          <w:iCs/>
+        </w:rPr>
+        <w:t xml:space="preserve"> A </w:t>
+      </w:r>
+      <w:r>
+        <w:t xml:space="preserve">sin</w:t>
+      </w:r>
+      <w:r>
+        <w:rPr>
+          <w:i/>
+          <w:iCs/>
+        </w:rPr>
+        <w:t xml:space="preserve"> B</w:t>
       </w:r>
       <w:r>
         <w:t xml:space="preserve">, not </w:t>
@@ -6166,7 +6186,7 @@
           <w:sz w:val="40"/>
           <w:szCs w:val="40"/>
         </w:rPr>
-        <w:t xml:space="preserve">4</w:t>
+        <w:t xml:space="preserve">4 </w:t>
       </w:r>
       <w:r>
         <w:rPr>
@@ -6192,7 +6212,7 @@
           <w:sz w:val="40"/>
           <w:szCs w:val="40"/>
         </w:rPr>
-        <w:t xml:space="preserve">(3x)=2−2</w:t>
+        <w:t xml:space="preserve">(3x)=2−2 </w:t>
       </w:r>
       <w:r>
         <w:rPr>
@@ -6371,7 +6391,7 @@
           <w:i/>
           <w:iCs/>
         </w:rPr>
-        <w:t xml:space="preserve">4</w:t>
+        <w:t xml:space="preserve">4 </w:t>
       </w:r>
       <w:r>
         <w:t xml:space="preserve">sin</w:t>
@@ -6389,7 +6409,7 @@
           <w:i/>
           <w:iCs/>
         </w:rPr>
-        <w:t xml:space="preserve">(3x)=2−2</w:t>
+        <w:t xml:space="preserve">(3x)=2−2 </w:t>
       </w:r>
       <w:r>
         <w:t xml:space="preserve">cos</w:t>
@@ -6419,7 +6439,7 @@
           <w:i/>
           <w:iCs/>
         </w:rPr>
-        <w:t xml:space="preserve">4</w:t>
+        <w:t xml:space="preserve">4 </w:t>
       </w:r>
       <w:r>
         <w:t xml:space="preserve">sin</w:t>
@@ -6447,7 +6467,7 @@
           <w:i/>
           <w:iCs/>
         </w:rPr>
-        <w:t xml:space="preserve">2−2</w:t>
+        <w:t xml:space="preserve">2−2 </w:t>
       </w:r>
       <w:r>
         <w:t xml:space="preserve">cos</w:t>
@@ -6469,7 +6489,7 @@
           <w:i/>
           <w:iCs/>
         </w:rPr>
-        <w:t xml:space="preserve">2−2</w:t>
+        <w:t xml:space="preserve">2−2 </w:t>
       </w:r>
       <w:r>
         <w:rPr>

</xml_diff>